<commit_message>
References: add reserved Zenodo DOIs for companion Papers I, II and the ledger
Zenodo drafts created (reserved DOIs, unpublished): Paper I = 10.5281/zenodo.21423308,
Paper II = 10.5281/zenodo.21423312, Observation Theory / ledger = 10.5281/zenodo.21423316.
Clears the reviewer's desk-check blocker on [20]-[22]. DOIs go live once the drafts are
published on Zenodo (pending author review). DOCX regenerated.

Co-Authored-By: Claude Opus 4.8 <noreply@anthropic.com>
</commit_message>
<xml_diff>
--- a/paper/ieee/observation-theory-ieee.docx
+++ b/paper/ieee/observation-theory-ieee.docx
@@ -210,7 +210,7 @@
     <w:p><w:pPr><w:pStyle w:val="FirstParagraph" /></w:pPr><w:r><w:t xml:space="preserve">The author used Claude (Anthropic) as an AI assistant during this work, in four</w:t></w:r><w:r><w:t xml:space="preserve"> </w:t></w:r><w:r><w:t xml:space="preserve">distinguishable roles:</w:t></w:r><w:r><w:t xml:space="preserve"> </w:t></w:r><w:r><w:rPr><w:i /><w:iCs /></w:rPr><w:t xml:space="preserve">(i) experimental coding and verification</w:t></w:r><w:r><w:t xml:space="preserve">—writing and</w:t></w:r><w:r><w:t xml:space="preserve"> </w:t></w:r><w:r><w:t xml:space="preserve">running the experiment harnesses and the continuous-integration reproduction workflow;</w:t></w:r><w:r><w:t xml:space="preserve"> </w:t></w:r><w:r><w:rPr><w:i /><w:iCs /></w:rPr><w:t xml:space="preserve">(ii) mathematical checking</w:t></w:r><w:r><w:t xml:space="preserve">—numerical and symbolic verification of the</w:t></w:r><w:r><w:t xml:space="preserve"> </w:t></w:r><w:r><w:t xml:space="preserve">propositions and appendix theorems, including an independent fresh-context</w:t></w:r><w:r><w:t xml:space="preserve"> </w:t></w:r><w:r><w:t xml:space="preserve">verification pass;</w:t></w:r><w:r><w:t xml:space="preserve"> </w:t></w:r><w:r><w:rPr><w:i /><w:iCs /></w:rPr><w:t xml:space="preserve">(iii) drafting</w:t></w:r><w:r><w:t xml:space="preserve"> </w:t></w:r><w:r><w:t xml:space="preserve">of expository prose; and</w:t></w:r><w:r><w:t xml:space="preserve"> </w:t></w:r><w:r><w:rPr><w:i /><w:iCs /></w:rPr><w:t xml:space="preserve">(iv) language</w:t></w:r><w:r><w:rPr><w:i /><w:iCs /></w:rPr><w:t xml:space="preserve"> </w:t></w:r><w:r><w:rPr><w:i /><w:iCs /></w:rPr><w:t xml:space="preserve">editing</w:t></w:r><w:r><w:t xml:space="preserve">. All theorem statements, proofs, experimental designs, registered</w:t></w:r><w:r><w:t xml:space="preserve"> </w:t></w:r><w:r><w:t xml:space="preserve">predictions, and claims were specified, reviewed, and accepted by the author, who is</w:t></w:r><w:r><w:t xml:space="preserve"> </w:t></w:r><w:r><w:t xml:space="preserve">solely responsible for the content.</w:t></w:r></w:p>
     <w:p><w:pPr><w:pStyle w:val="BodyText" /></w:pPr><w:r><w:t xml:space="preserve">All results resolve to committed registry entries and reproduction artifacts in the</w:t></w:r><w:r><w:t xml:space="preserve"> </w:t></w:r><w:r><w:t xml:space="preserve">public companion repository [22]; each registry entry is committed</w:t></w:r><w:r><w:t xml:space="preserve"> </w:t></w:r><w:r><w:rPr><w:i /><w:iCs /></w:rPr><w:t xml:space="preserve">before</w:t></w:r><w:r><w:t xml:space="preserve"> </w:t></w:r><w:r><w:t xml:space="preserve">the run it governs, so registration precedes experimentation in the</w:t></w:r><w:r><w:t xml:space="preserve"> </w:t></w:r><w:r><w:t xml:space="preserve">commit ordering of the public history. That ordering is not cryptographic third-party</w:t></w:r><w:r><w:t xml:space="preserve"> </w:t></w:r><w:r><w:t xml:space="preserve">proof; an external immutable deposit (Zenodo/OSF) accompanies the paper.</w:t></w:r></w:p>
     <w:bookmarkEnd w:id="57" />
-    <w:bookmarkStart w:id="61" w:name="references" />
+    <w:bookmarkStart w:id="58" w:name="references" />
     <w:p><w:pPr><w:pStyle w:val="Heading1" /></w:pPr><w:r><w:t xml:space="preserve">References</w:t></w:r></w:p>
     <w:p><w:pPr><w:numPr><w:ilvl w:val="0" /><w:numId w:val="1001" /></w:numPr></w:pPr><w:r><w:t xml:space="preserve">C. E. Shannon. A mathematical theory of communication.</w:t></w:r><w:r><w:t xml:space="preserve"> </w:t></w:r><w:r><w:rPr><w:i /><w:iCs /></w:rPr><w:t xml:space="preserve">Bell Syst. Tech. J.</w:t></w:r><w:r><w:t xml:space="preserve">, 27:379–423, 623–656, 1948.</w:t></w:r></w:p>
     <w:p><w:pPr><w:numPr><w:ilvl w:val="0" /><w:numId w:val="1001" /></w:numPr></w:pPr><w:r><w:t xml:space="preserve">C. E. Shannon. Coding theorems for a discrete source with a</w:t></w:r><w:r><w:t xml:space="preserve"> </w:t></w:r><w:r><w:t xml:space="preserve">fidelity criterion.</w:t></w:r><w:r><w:t xml:space="preserve"> </w:t></w:r><w:r><w:rPr><w:i /><w:iCs /></w:rPr><w:t xml:space="preserve">IRE Nat. Conv. Rec.</w:t></w:r><w:r><w:t xml:space="preserve">, 4:142–163, 1959.</w:t></w:r></w:p>
@@ -231,14 +231,14 @@
     <w:p><w:pPr><w:numPr><w:ilvl w:val="0" /><w:numId w:val="1001" /></w:numPr></w:pPr><w:r><w:t xml:space="preserve">B. Hassibi and D. G. Stork. Second order derivatives for</w:t></w:r><w:r><w:t xml:space="preserve"> </w:t></w:r><w:r><w:t xml:space="preserve">network pruning: Optimal Brain Surgeon.</w:t></w:r><w:r><w:t xml:space="preserve"> </w:t></w:r><w:r><w:rPr><w:i /><w:iCs /></w:rPr><w:t xml:space="preserve">NeurIPS</w:t></w:r><w:r><w:t xml:space="preserve">, 1993.</w:t></w:r></w:p>
     <w:p><w:pPr><w:numPr><w:ilvl w:val="0" /><w:numId w:val="1001" /></w:numPr></w:pPr><w:r><w:t xml:space="preserve">Z. Dong et al. HAWQ: Hessian aware quantization of neural</w:t></w:r><w:r><w:t xml:space="preserve"> </w:t></w:r><w:r><w:t xml:space="preserve">networks.</w:t></w:r><w:r><w:t xml:space="preserve"> </w:t></w:r><w:r><w:rPr><w:i /><w:iCs /></w:rPr><w:t xml:space="preserve">ICCV</w:t></w:r><w:r><w:t xml:space="preserve">, 2019.</w:t></w:r></w:p>
     <w:p><w:pPr><w:numPr><w:ilvl w:val="0" /><w:numId w:val="1001" /></w:numPr></w:pPr><w:r><w:t xml:space="preserve">E. Frantar, S. Ashkboos, T. Hoefler, and D. Alistarh.</w:t></w:r><w:r><w:t xml:space="preserve"> </w:t></w:r><w:r><w:t xml:space="preserve">GPTQ: Accurate post-training quantization for generative pre-trained transformers.</w:t></w:r><w:r><w:t xml:space="preserve"> </w:t></w:r><w:r><w:rPr><w:i /><w:iCs /></w:rPr><w:t xml:space="preserve">ICLR</w:t></w:r><w:r><w:t xml:space="preserve">, 2023.</w:t></w:r></w:p>
-    <w:p><w:pPr><w:numPr><w:ilvl w:val="0" /><w:numId w:val="1001" /></w:numPr></w:pPr><w:r><w:t xml:space="preserve">A. H. Bond. The angular observer: geodesic preservation and the</w:t></w:r><w:r><w:t xml:space="preserve"> </w:t></w:r><w:r><w:t xml:space="preserve">mode-budget inversion. Companion Paper I, 2026.</w:t></w:r><w:r><w:t xml:space="preserve"> </w:t></w:r><w:hyperlink r:id="rId58"><w:r><w:rPr><w:rStyle w:val="Hyperlink" /></w:rPr><w:t xml:space="preserve">https://github.com/ahb-sjsu/the-angular-observer</w:t></w:r></w:hyperlink></w:p>
-    <w:p><w:pPr><w:numPr><w:ilvl w:val="0" /><w:numId w:val="1001" /></w:numPr></w:pPr><w:r><w:t xml:space="preserve">A. H. Bond. Geometric key quantization: reconstruction is not the</w:t></w:r><w:r><w:t xml:space="preserve"> </w:t></w:r><w:r><w:t xml:space="preserve">target. Companion Paper II, 2026.</w:t></w:r><w:r><w:t xml:space="preserve"> </w:t></w:r><w:hyperlink r:id="rId59"><w:r><w:rPr><w:rStyle w:val="Hyperlink" /></w:rPr><w:t xml:space="preserve">https://github.com/ahb-sjsu/turboquant-pro</w:t></w:r></w:hyperlink></w:p>
-    <w:p><w:pPr><w:numPr><w:ilvl w:val="0" /><w:numId w:val="1001" /></w:numPr></w:pPr><w:r><w:t xml:space="preserve">A. H. Bond.</w:t></w:r><w:r><w:t xml:space="preserve"> </w:t></w:r><w:r><w:rPr><w:i /><w:iCs /></w:rPr><w:t xml:space="preserve">Geometric Observation: claim ledger,</w:t></w:r><w:r><w:rPr><w:i /><w:iCs /></w:rPr><w:t xml:space="preserve"> </w:t></w:r><w:r><w:rPr><w:i /><w:iCs /></w:rPr><w:t xml:space="preserve">prediction registry, and reproduction artifacts</w:t></w:r><w:r><w:t xml:space="preserve">. Companion repository, 2026.</w:t></w:r><w:r><w:t xml:space="preserve"> </w:t></w:r><w:hyperlink r:id="rId60"><w:r><w:rPr><w:rStyle w:val="Hyperlink" /></w:rPr><w:t xml:space="preserve">https://github.com/ahb-sjsu/geometric-observation</w:t></w:r></w:hyperlink></w:p>
+    <w:p><w:pPr><w:numPr><w:ilvl w:val="0" /><w:numId w:val="1001" /></w:numPr></w:pPr><w:r><w:t xml:space="preserve">A. H. Bond. The angular observer: geodesic preservation and the</w:t></w:r><w:r><w:t xml:space="preserve"> </w:t></w:r><w:r><w:t xml:space="preserve">mode-budget inversion. Companion Paper I, 2026, doi: 10.5281/zenodo.21423308.</w:t></w:r></w:p>
+    <w:p><w:pPr><w:numPr><w:ilvl w:val="0" /><w:numId w:val="1001" /></w:numPr></w:pPr><w:r><w:t xml:space="preserve">A. H. Bond. Geometric key quantization: reconstruction is not the</w:t></w:r><w:r><w:t xml:space="preserve"> </w:t></w:r><w:r><w:t xml:space="preserve">target. Companion Paper II, 2026, doi: 10.5281/zenodo.21423312.</w:t></w:r></w:p>
+    <w:p><w:pPr><w:numPr><w:ilvl w:val="0" /><w:numId w:val="1001" /></w:numPr></w:pPr><w:r><w:t xml:space="preserve">A. H. Bond.</w:t></w:r><w:r><w:t xml:space="preserve"> </w:t></w:r><w:r><w:rPr><w:i /><w:iCs /></w:rPr><w:t xml:space="preserve">Geometric Observation: claim ledger,</w:t></w:r><w:r><w:rPr><w:i /><w:iCs /></w:rPr><w:t xml:space="preserve"> </w:t></w:r><w:r><w:rPr><w:i /><w:iCs /></w:rPr><w:t xml:space="preserve">prediction registry, and reproduction artifacts</w:t></w:r><w:r><w:t xml:space="preserve">. Companion repository, 2026, doi: 10.5281/zenodo.21423316.</w:t></w:r></w:p>
     <w:p><w:pPr><w:numPr><w:ilvl w:val="0" /><w:numId w:val="1001" /></w:numPr></w:pPr><w:r><w:t xml:space="preserve">I. Csiszár. On an extremum problem of information theory.</w:t></w:r><w:r><w:t xml:space="preserve"> </w:t></w:r><w:r><w:rPr><w:i /><w:iCs /></w:rPr><w:t xml:space="preserve">Studia Sci. Math. Hungar.</w:t></w:r><w:r><w:t xml:space="preserve">, 9:57–71, 1974.</w:t></w:r></w:p>
     <w:p><w:pPr><w:numPr><w:ilvl w:val="0" /><w:numId w:val="1001" /></w:numPr></w:pPr><w:r><w:t xml:space="preserve">A. S. Kechris.</w:t></w:r><w:r><w:t xml:space="preserve"> </w:t></w:r><w:r><w:rPr><w:i /><w:iCs /></w:rPr><w:t xml:space="preserve">Classical Descriptive Set Theory</w:t></w:r><w:r><w:t xml:space="preserve">.</w:t></w:r><w:r><w:t xml:space="preserve"> </w:t></w:r><w:r><w:t xml:space="preserve">Springer GTM 156, 1995 (Jankov–von Neumann uniformization, §18).</w:t></w:r></w:p>
     <w:p><w:pPr><w:numPr><w:ilvl w:val="0" /><w:numId w:val="1001" /></w:numPr></w:pPr><w:r><w:t xml:space="preserve">T. Linder and R. Zamir. High-resolution source coding for</w:t></w:r><w:r><w:t xml:space="preserve"> </w:t></w:r><w:r><w:t xml:space="preserve">non-difference distortion measures: the rate-distortion function.</w:t></w:r><w:r><w:t xml:space="preserve"> </w:t></w:r><w:r><w:rPr><w:i /><w:iCs /></w:rPr><w:t xml:space="preserve">IEEE Trans. Inf. Theory</w:t></w:r><w:r><w:t xml:space="preserve">, 45(2):533–547, 1999.</w:t></w:r></w:p>
     <w:p><w:pPr><w:numPr><w:ilvl w:val="0" /><w:numId w:val="1001" /></w:numPr></w:pPr><w:r><w:t xml:space="preserve">V. Kostina and S. Verdú. Fixed-length lossy compression</w:t></w:r><w:r><w:t xml:space="preserve"> </w:t></w:r><w:r><w:t xml:space="preserve">in the finite blocklength regime.</w:t></w:r><w:r><w:t xml:space="preserve"> </w:t></w:r><w:r><w:rPr><w:i /><w:iCs /></w:rPr><w:t xml:space="preserve">IEEE Trans. Inf. Theory</w:t></w:r><w:r><w:t xml:space="preserve">,</w:t></w:r><w:r><w:t xml:space="preserve"> </w:t></w:r><w:r><w:t xml:space="preserve">58(6):3309–3338, 2012.</w:t></w:r></w:p>
-    <w:bookmarkEnd w:id="61" />
+    <w:bookmarkEnd w:id="58" />
     <w:sectPr>
       <w:footnotePr>
         

</xml_diff>

<commit_message>
GO-P-2026-027 PASS: E's omission floor is [demonstrated] downstream (held-out)
Ran the sealed asymptotic-floor gate on Atlas GPU 1, held-out layers {4,20} (exploratory
used {8,16}), different corpus. VERDICT: ALL PASS.
- Read-metric floor reached 16/16.
- Downstream floor 16/16: infinite-rate misidentified softmax-KL is 800-5700x the matched
  operator (median 0.10 nats) -- all heads clear the sealed bars (ratio>=100, floor>=0.01)
  by 1-2 orders of magnitude, out-of-sample.

Appendix-E's omission floor is thus [demonstrated] downstream on a trained model. Ledger
NEG-13 upgraded (missed sealed finite-rate gate -> demonstrated via GO-P-2026-027); the
mismatch-appendix note in both papers now cites the sealed held-out confirmation. Result
JSON committed; both papers recompiled (IEEE 15pp, repo 22pp); DOCX rebuilt.

Co-Authored-By: Claude Opus 4.8 <noreply@anthropic.com>
</commit_message>
<xml_diff>
--- a/paper/ieee/observation-theory-ieee.docx
+++ b/paper/ieee/observation-theory-ieee.docx
@@ -66915,13 +66915,45 @@
         </m:r>
       </m:oMath>
       <w:r>
-        <w:t xml:space="preserve">. A prospective test on a trained Llama-3.2-3B layer (GO-P-2026-026) exhibits the floor: on</w:t>
-      </w:r>
-      <w:r>
-        <w:t xml:space="preserve"> </w:t>
-      </w:r>
-      <w:r>
-        <w:t xml:space="preserve">all</w:t>
+        <w:t xml:space="preserve">. A sealed, held-out prospective test (GO-P-2026-027, layers</w:t>
+      </w:r>
+      <w:r>
+        <w:t xml:space="preserve"> </w:t>
+      </w:r>
+      <m:oMath>
+        <m:r>
+          <m:rPr>
+            <m:sty m:val="p"/>
+          </m:rPr>
+          <m:t>{</m:t>
+        </m:r>
+        <m:r>
+          <m:t>4</m:t>
+        </m:r>
+        <m:r>
+          <m:rPr>
+            <m:sty m:val="p"/>
+          </m:rPr>
+          <m:t>,</m:t>
+        </m:r>
+        <m:r>
+          <m:t>20</m:t>
+        </m:r>
+        <m:r>
+          <m:rPr>
+            <m:sty m:val="p"/>
+          </m:rPr>
+          <m:t>}</m:t>
+        </m:r>
+      </m:oMath>
+      <w:r>
+        <w:t xml:space="preserve">) confirms the floor</w:t>
+      </w:r>
+      <w:r>
+        <w:t xml:space="preserve"> </w:t>
+      </w:r>
+      <w:r>
+        <w:t xml:space="preserve">operationally on all</w:t>
       </w:r>
       <w:r>
         <w:t xml:space="preserve"> </w:t>
@@ -66935,93 +66967,29 @@
         <w:t xml:space="preserve"> </w:t>
       </w:r>
       <w:r>
-        <w:t xml:space="preserve">KV heads the true read distortion</w:t>
-      </w:r>
-      <w:r>
-        <w:t xml:space="preserve"> </w:t>
-      </w:r>
-      <m:oMath>
-        <m:r>
-          <m:rPr>
-            <m:sty m:val="p"/>
-          </m:rPr>
-          <m:t>tr</m:t>
-        </m:r>
-        <m:r>
-          <m:rPr>
-            <m:sty m:val="p"/>
-          </m:rPr>
-          <m:t>(</m:t>
-        </m:r>
-        <m:r>
-          <m:t>P</m:t>
-        </m:r>
-        <m:sSub>
-          <m:e>
-            <m:r>
-              <m:rPr>
-                <m:sty m:val="p"/>
-              </m:rPr>
-              <m:t>Σ</m:t>
-            </m:r>
-          </m:e>
-          <m:sub>
-            <m:r>
-              <m:t>δ</m:t>
-            </m:r>
-          </m:sub>
-        </m:sSub>
-        <m:r>
-          <m:rPr>
-            <m:sty m:val="p"/>
-          </m:rPr>
-          <m:t>)</m:t>
-        </m:r>
-      </m:oMath>
-      <w:r>
-        <w:t xml:space="preserve"> </w:t>
-      </w:r>
-      <w:r>
-        <w:t xml:space="preserve">saturates at the</w:t>
-      </w:r>
-      <w:r>
-        <w:t xml:space="preserve"> </w:t>
-      </w:r>
-      <w:r>
-        <w:rPr>
-          <w:i/>
-          <w:iCs/>
-        </w:rPr>
-        <w:t xml:space="preserve">measured</w:t>
-      </w:r>
-      <w:r>
-        <w:t xml:space="preserve"> </w:t>
-      </w:r>
-      <w:r>
-        <w:t xml:space="preserve">whitened-kernel value, and the infinite-rate misidentified coder plateaus</w:t>
-      </w:r>
-      <w:r>
-        <w:t xml:space="preserve"> </w:t>
-      </w:r>
-      <w:r>
-        <w:t xml:space="preserve">at a softmax divergence some</w:t>
-      </w:r>
-      <w:r>
-        <w:t xml:space="preserve"> </w:t>
-      </w:r>
-      <m:oMath>
-        <m:sSup>
-          <m:e>
-            <m:r>
-              <m:t>10</m:t>
-            </m:r>
-          </m:e>
-          <m:sup>
-            <m:r>
-              <m:t>5</m:t>
-            </m:r>
-          </m:sup>
-        </m:sSup>
+        <w:t xml:space="preserve">KV heads: the read-metric floor is reached, and the infinite-rate</w:t>
+      </w:r>
+      <w:r>
+        <w:t xml:space="preserve"> </w:t>
+      </w:r>
+      <w:r>
+        <w:t xml:space="preserve">misidentified coder plateaus at a softmax divergence</w:t>
+      </w:r>
+      <w:r>
+        <w:t xml:space="preserve"> </w:t>
+      </w:r>
+      <m:oMath>
+        <m:r>
+          <m:t>800</m:t>
+        </m:r>
+      </m:oMath>
+      <w:r>
+        <w:t xml:space="preserve">–</w:t>
+      </w:r>
+      <m:oMath>
+        <m:r>
+          <m:t>5700</m:t>
+        </m:r>
         <m:r>
           <m:rPr>
             <m:sty m:val="p"/>
@@ -67033,7 +67001,13 @@
         <w:t xml:space="preserve"> </w:t>
       </w:r>
       <w:r>
-        <w:t xml:space="preserve">that of the matched operator (median</w:t>
+        <w:t xml:space="preserve">that of the matched</w:t>
+      </w:r>
+      <w:r>
+        <w:t xml:space="preserve"> </w:t>
+      </w:r>
+      <w:r>
+        <w:t xml:space="preserve">operator (median</w:t>
       </w:r>
       <w:r>
         <w:t xml:space="preserve"> </w:t>
@@ -67047,31 +67021,31 @@
         <w:t xml:space="preserve"> </w:t>
       </w:r>
       <w:r>
-        <w:t xml:space="preserve">nats)—a genuine downstream floor. A finite-rate sweep initially missed this, the softmax</w:t>
-      </w:r>
-      <w:r>
-        <w:t xml:space="preserve"> </w:t>
-      </w:r>
-      <w:r>
-        <w:t xml:space="preserve">divergence still being dominated by the reducible read-mode error at the swept rates; the</w:t>
-      </w:r>
-      <w:r>
-        <w:t xml:space="preserve"> </w:t>
-      </w:r>
-      <w:r>
-        <w:t xml:space="preserve">floor is thus a high-resolution phenomenon whose finite-rate visibility scales with the</w:t>
-      </w:r>
-      <w:r>
-        <w:t xml:space="preserve"> </w:t>
-      </w:r>
-      <w:r>
-        <w:t xml:space="preserve">omitted direction’s downstream weight. It remains a certificate about the read metric that</w:t>
-      </w:r>
-      <w:r>
-        <w:t xml:space="preserve"> </w:t>
-      </w:r>
-      <w:r>
-        <w:t xml:space="preserve">the consumer’s own metric inherits only in the high-rate limit.</w:t>
+        <w:t xml:space="preserve">nats)—a genuine downstream wall, out-of-sample from the layers on</w:t>
+      </w:r>
+      <w:r>
+        <w:t xml:space="preserve"> </w:t>
+      </w:r>
+      <w:r>
+        <w:t xml:space="preserve">which the effect was first seen. A finite-rate sweep initially missed it (the reducible</w:t>
+      </w:r>
+      <w:r>
+        <w:t xml:space="preserve"> </w:t>
+      </w:r>
+      <w:r>
+        <w:t xml:space="preserve">read-mode error dominates the swept rates), so the floor is a high-resolution phenomenon</w:t>
+      </w:r>
+      <w:r>
+        <w:t xml:space="preserve"> </w:t>
+      </w:r>
+      <w:r>
+        <w:t xml:space="preserve">whose finite-rate visibility scales with the omitted direction’s downstream weight; the</w:t>
+      </w:r>
+      <w:r>
+        <w:t xml:space="preserve"> </w:t>
+      </w:r>
+      <w:r>
+        <w:t xml:space="preserve">consumer’s own metric inherits it in the high-rate limit.</w:t>
       </w:r>
     </w:p>
     <w:bookmarkEnd w:id="71"/>

</xml_diff>

<commit_message>
Cite Zenodo concept DOIs instead of v1 version DOIs
Switch archival/companion citations from the pinned v1 version DOIs to the version-agnostic
Zenodo concept DOIs so they resolve to the latest published version:
  21423308 -> 21423307 (Paper I / angular observer)
  21423312 -> 21423311 (Paper II / TurboQuant-Pro)
  21423316 -> 21423315 (Observation Theory / ledger)

Co-Authored-By: Claude Opus 4.8 <noreply@anthropic.com>
</commit_message>
<xml_diff>
--- a/paper/ieee/observation-theory-ieee.docx
+++ b/paper/ieee/observation-theory-ieee.docx
@@ -67799,7 +67799,7 @@
         <w:t xml:space="preserve"> </w:t>
       </w:r>
       <w:r>
-        <w:t xml:space="preserve">mode-budget inversion. Companion Paper I, 2026, doi: 10.5281/zenodo.21423308.</w:t>
+        <w:t xml:space="preserve">mode-budget inversion. Companion Paper I, 2026, doi: 10.5281/zenodo.21423307.</w:t>
       </w:r>
     </w:p>
     <w:p>
@@ -67816,7 +67816,7 @@
         <w:t xml:space="preserve"> </w:t>
       </w:r>
       <w:r>
-        <w:t xml:space="preserve">target. Companion Paper II, 2026, doi: 10.5281/zenodo.21423312.</w:t>
+        <w:t xml:space="preserve">target. Companion Paper II, 2026, doi: 10.5281/zenodo.21423311.</w:t>
       </w:r>
     </w:p>
     <w:p>
@@ -67854,7 +67854,7 @@
         <w:t xml:space="preserve">prediction registry, and reproduction artifacts</w:t>
       </w:r>
       <w:r>
-        <w:t xml:space="preserve">. Companion repository, 2026, doi: 10.5281/zenodo.21423316.</w:t>
+        <w:t xml:space="preserve">. Companion repository, 2026, doi: 10.5281/zenodo.21423315.</w:t>
       </w:r>
     </w:p>
     <w:p>

</xml_diff>